<commit_message>
feat: publish-documents 0.2.0 — DOCX no estilo técnico e números de equação preservados
- word-editable: novo estilo padrão `tecnico` (Cambria, títulos azul-marinho, tabelas booktabs,
  `>` como quadro sombreado), portado do pipeline ref_rck do autor; ABNT vira `--docx-style abnt`
  e deixa de vazar recuo e justificação para as células de tabela
- \tag{n} preservado no DOCX: filtro eq-tags.lua + pós-processamento que põe o número alinhado à
  direita (ou logo após a equação em lista, quadro e tabela); \tag* sem parênteses; notas de rodapé
- verify reprova equação com \tag sem número e marcadores que sobraram; preflight reprova títulos
  já numerados com number-sections, \tag junto de {#eq-} e avisa \tag em ambiente LaTeX cru
- reference docs com elementos na ordem do schema OOXML
- remove do índice estado interno do .omc/ commitado por engano
- 15 testes

Co-Authored-By: Claude Opus 5.5 <noreply@anthropic.com>
</commit_message>
<xml_diff>
--- a/publish-documents/templates/word/reference-abnt.docx
+++ b/publish-documents/templates/word/reference-abnt.docx
@@ -505,6 +505,7 @@
     <w:qFormat/>
     <w:pPr>
       <w:spacing w:line="360" w:lineRule="auto" w:before="0" w:after="0"/>
+      <w:ind w:firstLine="0"/>
       <w:jc w:val="both"/>
     </w:pPr>
     <w:rPr>
@@ -525,7 +526,6 @@
     </w:pPr>
     <w:rPr>
       <w:rFonts w:ascii="Times New Roman" w:hAnsi="Times New Roman" w:cs="Times New Roman" w:eastAsia="Times New Roman"/>
-      <w:color w:val="000000"/>
       <w:sz w:val="24"/>
     </w:rPr>
   </w:style>
@@ -541,7 +541,6 @@
     </w:pPr>
     <w:rPr>
       <w:rFonts w:ascii="Times New Roman" w:hAnsi="Times New Roman" w:cs="Times New Roman" w:eastAsia="Times New Roman"/>
-      <w:color w:val="000000"/>
       <w:sz w:val="24"/>
     </w:rPr>
   </w:style>
@@ -551,12 +550,12 @@
     <w:qFormat/>
     <w:pPr>
       <w:spacing w:before="0" w:after="0" w:line="240" w:lineRule="auto"/>
+      <w:ind w:firstLine="0" w:left="0"/>
       <w:jc w:val="left"/>
     </w:pPr>
     <w:rPr>
       <w:rFonts w:ascii="Times New Roman" w:hAnsi="Times New Roman" w:cs="Times New Roman" w:eastAsia="Times New Roman"/>
-      <w:color w:val="000000"/>
-      <w:sz w:val="24"/>
+      <w:sz w:val="20"/>
     </w:rPr>
   </w:style>
   <w:style w:type="paragraph" w:styleId="Title">
@@ -568,7 +567,7 @@
     <w:qFormat/>
     <w:rsid w:val="00A10FD9"/>
     <w:pPr>
-      <w:spacing w:after="240" w:line="360" w:lineRule="auto" w:before="0"/>
+      <w:spacing w:after="240" w:line="240" w:lineRule="auto"/>
       <w:contextualSpacing/>
       <w:jc w:val="center"/>
     </w:pPr>
@@ -605,12 +604,13 @@
       <w:numPr>
         <w:ilvl w:val="1"/>
       </w:numPr>
-      <w:spacing w:line="360" w:lineRule="auto" w:before="0" w:after="240"/>
+      <w:spacing w:after="240"/>
       <w:jc w:val="center"/>
     </w:pPr>
     <w:rPr>
       <w:rFonts w:ascii="Times New Roman" w:hAnsi="Times New Roman" w:cs="Times New Roman" w:eastAsia="Times New Roman"/>
       <w:b w:val="0"/>
+      <w:i w:val="0"/>
       <w:caps w:val="0"/>
       <w:color w:val="000000"/>
       <w:spacing w:val="15"/>
@@ -640,12 +640,11 @@
     <w:pPr>
       <w:keepNext/>
       <w:keepLines/>
-      <w:spacing w:line="360" w:lineRule="auto" w:before="0" w:after="0"/>
       <w:jc w:val="center"/>
     </w:pPr>
     <w:rPr>
       <w:rFonts w:ascii="Times New Roman" w:hAnsi="Times New Roman" w:cs="Times New Roman" w:eastAsia="Times New Roman"/>
-      <w:b w:val="0"/>
+      <w:i w:val="0"/>
       <w:caps w:val="0"/>
       <w:color w:val="000000"/>
       <w:sz w:val="24"/>
@@ -660,12 +659,11 @@
     <w:pPr>
       <w:keepNext/>
       <w:keepLines/>
-      <w:spacing w:line="360" w:lineRule="auto" w:before="0" w:after="0"/>
       <w:jc w:val="center"/>
     </w:pPr>
     <w:rPr>
       <w:rFonts w:ascii="Times New Roman" w:hAnsi="Times New Roman" w:cs="Times New Roman" w:eastAsia="Times New Roman"/>
-      <w:b w:val="0"/>
+      <w:i w:val="0"/>
       <w:caps w:val="0"/>
       <w:color w:val="000000"/>
       <w:sz w:val="24"/>
@@ -698,11 +696,11 @@
       <w:keepNext/>
       <w:keepLines/>
       <w:spacing w:before="120" w:after="120" w:line="240" w:lineRule="auto"/>
+      <w:ind w:firstLine="0"/>
       <w:jc w:val="both"/>
     </w:pPr>
     <w:rPr>
       <w:rFonts w:ascii="Times New Roman" w:hAnsi="Times New Roman" w:cs="Times New Roman" w:eastAsia="Times New Roman"/>
-      <w:color w:val="000000"/>
       <w:sz w:val="24"/>
       <w:szCs w:val="20"/>
     </w:rPr>
@@ -713,13 +711,12 @@
     <w:next w:val="Bibliography"/>
     <w:qFormat/>
     <w:pPr>
-      <w:spacing w:line="240" w:lineRule="auto" w:before="0" w:after="240"/>
+      <w:spacing w:line="240" w:lineRule="auto" w:after="240"/>
       <w:ind w:firstLine="0"/>
       <w:jc w:val="left"/>
     </w:pPr>
     <w:rPr>
       <w:rFonts w:ascii="Times New Roman" w:hAnsi="Times New Roman" w:cs="Times New Roman" w:eastAsia="Times New Roman"/>
-      <w:color w:val="000000"/>
       <w:sz w:val="24"/>
     </w:rPr>
   </w:style>
@@ -734,7 +731,7 @@
     <w:pPr>
       <w:keepNext/>
       <w:keepLines/>
-      <w:spacing w:before="360" w:after="240" w:line="360" w:lineRule="auto"/>
+      <w:spacing w:before="360" w:after="240"/>
       <w:ind w:firstLine="0"/>
       <w:jc w:val="left"/>
       <w:outlineLvl w:val="0"/>
@@ -761,7 +758,7 @@
     <w:pPr>
       <w:keepNext/>
       <w:keepLines/>
-      <w:spacing w:before="240" w:after="240" w:line="360" w:lineRule="auto"/>
+      <w:spacing w:before="240" w:after="240"/>
       <w:ind w:firstLine="0"/>
       <w:jc w:val="left"/>
       <w:outlineLvl w:val="1"/>
@@ -788,7 +785,7 @@
     <w:pPr>
       <w:keepNext/>
       <w:keepLines/>
-      <w:spacing w:before="240" w:after="120" w:line="360" w:lineRule="auto"/>
+      <w:spacing w:before="240" w:after="120"/>
       <w:ind w:firstLine="0"/>
       <w:jc w:val="left"/>
       <w:outlineLvl w:val="2"/>
@@ -815,13 +812,14 @@
     <w:pPr>
       <w:keepNext/>
       <w:keepLines/>
-      <w:spacing w:before="240" w:after="120" w:line="360" w:lineRule="auto"/>
+      <w:spacing w:before="240" w:after="120"/>
       <w:ind w:firstLine="0"/>
       <w:jc w:val="left"/>
       <w:outlineLvl w:val="3"/>
     </w:pPr>
     <w:rPr>
       <w:rFonts w:ascii="Times New Roman" w:hAnsi="Times New Roman" w:cs="Times New Roman" w:eastAsia="Times New Roman"/>
+      <w:b w:val="0"/>
       <w:i/>
       <w:iCs/>
       <w:color w:val="000000"/>
@@ -841,13 +839,14 @@
     <w:pPr>
       <w:keepNext/>
       <w:keepLines/>
-      <w:spacing w:before="240" w:after="120" w:line="360" w:lineRule="auto"/>
+      <w:spacing w:before="240" w:after="120"/>
       <w:ind w:firstLine="0"/>
       <w:jc w:val="left"/>
       <w:outlineLvl w:val="4"/>
     </w:pPr>
     <w:rPr>
       <w:rFonts w:ascii="Times New Roman" w:hAnsi="Times New Roman" w:cs="Times New Roman" w:eastAsia="Times New Roman"/>
+      <w:b w:val="0"/>
       <w:i/>
       <w:color w:val="000000"/>
       <w:sz w:val="24"/>
@@ -1068,13 +1067,12 @@
     <w:unhideWhenUsed/>
     <w:qFormat/>
     <w:pPr>
-      <w:spacing w:before="0" w:after="0" w:line="240" w:lineRule="auto"/>
+      <w:spacing w:before="120" w:after="120" w:line="240" w:lineRule="auto"/>
       <w:ind w:left="2268" w:right="480" w:firstLine="0"/>
       <w:jc w:val="both"/>
     </w:pPr>
     <w:rPr>
       <w:rFonts w:ascii="Times New Roman" w:hAnsi="Times New Roman" w:cs="Times New Roman" w:eastAsia="Times New Roman"/>
-      <w:color w:val="000000"/>
       <w:sz w:val="20"/>
     </w:rPr>
   </w:style>
@@ -1086,12 +1084,11 @@
     <w:unhideWhenUsed/>
     <w:qFormat/>
     <w:pPr>
-      <w:spacing w:line="240" w:lineRule="auto" w:before="0" w:after="0"/>
+      <w:spacing w:line="240" w:lineRule="auto"/>
       <w:jc w:val="both"/>
     </w:pPr>
     <w:rPr>
       <w:rFonts w:ascii="Times New Roman" w:hAnsi="Times New Roman" w:cs="Times New Roman" w:eastAsia="Times New Roman"/>
-      <w:color w:val="000000"/>
       <w:sz w:val="20"/>
     </w:rPr>
   </w:style>
@@ -1120,6 +1117,11 @@
     <w:qFormat/>
     <w:tblPr>
       <w:tblInd w:w="0" w:type="dxa"/>
+      <w:tblBorders>
+        <w:top w:val="single" w:sz="12" w:space="0" w:color="000000"/>
+        <w:bottom w:val="single" w:sz="12" w:space="0" w:color="000000"/>
+        <w:insideH w:val="single" w:sz="4" w:space="0" w:color="BFBFBF"/>
+      </w:tblBorders>
       <w:tblCellMar>
         <w:top w:w="0" w:type="dxa"/>
         <w:left w:w="108" w:type="dxa"/>
@@ -1128,11 +1130,13 @@
       </w:tblCellMar>
     </w:tblPr>
     <w:tblStylePr w:type="firstRow">
+      <w:rPr>
+        <w:b/>
+      </w:rPr>
       <w:tcPr>
         <w:tcBorders>
-          <w:bottom w:val="single"/>
+          <w:bottom w:val="single" w:sz="8" w:space="0" w:color="000000"/>
         </w:tcBorders>
-        <w:vAlign w:val="bottom"/>
       </w:tcPr>
     </w:tblStylePr>
   </w:style>
@@ -1250,7 +1254,7 @@
     <w:unhideWhenUsed/>
     <w:qFormat/>
     <w:pPr>
-      <w:spacing w:before="0" w:line="360" w:lineRule="auto" w:after="240"/>
+      <w:spacing w:before="240" w:line="259" w:lineRule="auto" w:after="240"/>
       <w:jc w:val="center"/>
       <w:outlineLvl w:val="9"/>
     </w:pPr>

</xml_diff>